<commit_message>
Implement TubeFactory workflow and UX updates
</commit_message>
<xml_diff>
--- a/docs/FaktischSimpel-Automatisierungsworkflow.docx
+++ b/docs/FaktischSimpel-Automatisierungsworkflow.docx
@@ -54,7 +54,7 @@
                 <w:color w:val="FFFFFF"/>
                 <w:sz w:val="20"/>
               </w:rPr>
-              <w:t>LIVE VALIDIERT: 21. JULI 2026  |  BRANCH: dev  |  WORKFLOW: v1</w:t>
+              <w:t>LIVE VALIDIERT: 22. JULI 2026  |  BRANCH: dev  |  WORKFLOW: v2</w:t>
             </w:r>
           </w:p>
         </w:tc>
@@ -451,7 +451,7 @@
         <w:t xml:space="preserve">3. </w:t>
       </w:r>
       <w:r>
-        <w:t>Quellen werden normalisiert und als unveränderliche Snapshots gesichert; Claims, Gegenbelege und offene Fragen werden einzeln freigegeben.</w:t>
+        <w:t>Die KI zerlegt das Thema in mindestens sechs Erkläreinheiten. Quellen werden normalisiert und als unveränderliche Snapshots gesichert; Claims bleiben exakt an Fundstellen gebunden.</w:t>
       </w:r>
     </w:p>
     <w:p>
@@ -465,7 +465,7 @@
         <w:t xml:space="preserve">4. </w:t>
       </w:r>
       <w:r>
-        <w:t>Der Script Writer erzeugt ein deutsches, schrittweises Erklärskript ausschließlich aus freigegebenen Claims und Evidence-IDs.</w:t>
+        <w:t>Explanation Readiness prüft Wort- und Zeitkorridor, Claim-Dichte, Abdeckung aller wesentlichen Erkläreinheiten, unabhängige Quellen, Primärquellen und Gegenbelegsuche. Lücken lösen bis zu drei gezielte Evidenzrunden aus.</w:t>
       </w:r>
     </w:p>
     <w:p>
@@ -479,7 +479,7 @@
         <w:t xml:space="preserve">5. </w:t>
       </w:r>
       <w:r>
-        <w:t>Ein separat zugewiesenes Verifier-Modell kontrolliert Belegtreue, Kausalität, Unsicherheit, Gegenpositionen und Verständlichkeit.</w:t>
+        <w:t>Der Script Writer erzeugt ein deutsches, schrittweises Erklärskript ausschließlich aus freigegebenen Claims und Evidence-IDs.</w:t>
       </w:r>
     </w:p>
     <w:p>
@@ -493,6 +493,20 @@
         <w:t xml:space="preserve">6. </w:t>
       </w:r>
       <w:r>
+        <w:t>Ein separat zugewiesenes Verifier-Modell kontrolliert Belegtreue, Kausalität, Unsicherheit, Gegenpositionen und Verständlichkeit.</w:t>
+      </w:r>
+    </w:p>
+    <w:p>
+      <w:pPr>
+        <w:ind w:left="369" w:hanging="369"/>
+      </w:pPr>
+      <w:r>
+        <w:rPr>
+          <w:b/>
+        </w:rPr>
+        <w:t xml:space="preserve">7. </w:t>
+      </w:r>
+      <w:r>
         <w:t>Das Storyboard übersetzt jeden Erklärschritt in quellengebundene, zugängliche Visuals; synthetische Darstellungen realer Ereignisse dürfen nicht wie Dokumentation wirken.</w:t>
       </w:r>
     </w:p>
@@ -504,7 +518,7 @@
         <w:rPr>
           <w:b/>
         </w:rPr>
-        <w:t xml:space="preserve">7. </w:t>
+        <w:t xml:space="preserve">8. </w:t>
       </w:r>
       <w:r>
         <w:t>Nach Skript, Storyboard und exaktem Render greifen eigene menschliche Gates. Der Upload erfolgt privat, die Veröffentlichung separat.</w:t>
@@ -1431,7 +1445,7 @@
       <w:r>
         <w:drawing>
           <wp:inline xmlns:a="http://schemas.openxmlformats.org/drawingml/2006/main" xmlns:pic="http://schemas.openxmlformats.org/drawingml/2006/picture">
-            <wp:extent cx="5669280" cy="4682498"/>
+            <wp:extent cx="5669280" cy="4387093"/>
             <wp:docPr id="3" name="Picture 3"/>
             <wp:cNvGraphicFramePr>
               <a:graphicFrameLocks noChangeAspect="1"/>
@@ -1452,7 +1466,7 @@
                   <pic:spPr>
                     <a:xfrm>
                       <a:off x="0" y="0"/>
-                      <a:ext cx="5669280" cy="4682498"/>
+                      <a:ext cx="5669280" cy="4387093"/>
                     </a:xfrm>
                     <a:prstGeom prst="rect"/>
                   </pic:spPr>
@@ -1543,7 +1557,21 @@
         <w:t xml:space="preserve">4. </w:t>
       </w:r>
       <w:r>
-        <w:t>Ein manueller Live-Discovery-Lauf durchlief Planvalidierung, sieben private Metasuche-Abfragen, Clustering und Scoring bis OPPORTUNITY_REVIEW bei 100 %.</w:t>
+        <w:t>Ein korrigierter manueller Live-Discovery-Lauf führte sieben private Metasuche-Abfragen nacheinander und mit Abstand aus. Aktuelle Suchen dürfen kontrolliert auf eine zeitlose Suche zurückfallen; Primär- und Gegenbelegzweige arbeiten grundsätzlich zeitlos.</w:t>
+      </w:r>
+    </w:p>
+    <w:p>
+      <w:pPr>
+        <w:ind w:left="369" w:hanging="369"/>
+      </w:pPr>
+      <w:r>
+        <w:rPr>
+          <w:b/>
+        </w:rPr>
+        <w:t xml:space="preserve">5. </w:t>
+      </w:r>
+      <w:r>
+        <w:t>Der verifizierte Lauf sichtete 70 Rohresultate, verwarf 52 nicht erklärgeeignete Plattform- und Navigationstreffer, deduplizierte 18 geeignete Funde und erzeugte 11 neue, quellenverknüpfte Opportunities.</w:t>
       </w:r>
     </w:p>
     <w:p>
@@ -1608,7 +1636,7 @@
       <w:r>
         <w:drawing>
           <wp:inline xmlns:a="http://schemas.openxmlformats.org/drawingml/2006/main" xmlns:pic="http://schemas.openxmlformats.org/drawingml/2006/picture">
-            <wp:extent cx="5715000" cy="1737306"/>
+            <wp:extent cx="5715000" cy="3890255"/>
             <wp:docPr id="5" name="Picture 5"/>
             <wp:cNvGraphicFramePr>
               <a:graphicFrameLocks noChangeAspect="1"/>
@@ -1629,7 +1657,7 @@
                   <pic:spPr>
                     <a:xfrm>
                       <a:off x="0" y="0"/>
-                      <a:ext cx="5715000" cy="1737306"/>
+                      <a:ext cx="5715000" cy="3890255"/>
                     </a:xfrm>
                     <a:prstGeom prst="rect"/>
                   </pic:spPr>
@@ -1651,7 +1679,7 @@
           <w:color w:val="5E6E74"/>
           <w:sz w:val="16"/>
         </w:rPr>
-        <w:t>Abbildung 5 – Der manuelle Live-Discovery-Test wurde dauerhaft orchestriert und vollständig abgeschlossen.</w:t>
+        <w:t>Abbildung 5 – Der korrigierte Live-Lauf zeigt Orchestrierungsstatus und Suchquellen-Gesundheit getrennt; ArXiv, Bing und Bing News antworteten im Browser-Nachweis.</w:t>
       </w:r>
     </w:p>
     <w:tbl>
@@ -1678,10 +1706,10 @@
                 <w:b/>
                 <w:color w:val="0D6F70"/>
               </w:rPr>
-              <w:t xml:space="preserve">Ergebnis des Testlaufs  </w:t>
+              <w:t xml:space="preserve">Korrektur des früheren Leer-Laufs  </w:t>
             </w:r>
             <w:r>
-              <w:t>Der Validierungslauf war technisch erfolgreich, lieferte in diesem kurzen Suchfenster aber keine neue Opportunity. Das ist ein zulässiges fachliches Ergebnis: Ein leerer Lauf darf keine künstlichen Themen erzeugen. Der nächste geplante Lauf bleibt aktiv.</w:t>
+              <w:t>Der frühere Null-Treffer-Lauf war kein fachlich leerer Themenmarkt. Brave war gedrosselt, DuckDuckGo und Startpage verlangten CAPTCHAs, SearXNG meldete diese Ausfälle aber zusammen mit HTTP 200. TubeFactory verwirft diese Diagnose nicht mehr: Null Treffer bei nicht erreichbaren Engines stoppt den Lauf als SOURCE_UNAVAILABLE mit Wiederholungsmöglichkeit. Teilabdeckung erscheint als degraded; nur belegte Quellenabdeckung erscheint healthy.</w:t>
             </w:r>
           </w:p>
         </w:tc>
@@ -2134,6 +2162,84 @@
                 <w:color w:val="142C35"/>
                 <w:sz w:val="17"/>
               </w:rPr>
+              <w:t>AI-Protokolltrennung</w:t>
+            </w:r>
+          </w:p>
+        </w:tc>
+        <w:tc>
+          <w:tcPr>
+            <w:tcW w:type="dxa" w:w="4876"/>
+            <w:vAlign w:val="center"/>
+          </w:tcPr>
+          <w:p>
+            <w:r/>
+            <w:r>
+              <w:rPr>
+                <w:rFonts w:ascii="Liberation Sans" w:hAnsi="Liberation Sans"/>
+                <w:b w:val="0"/>
+                <w:color w:val="142C35"/>
+                <w:sz w:val="17"/>
+              </w:rPr>
+              <w:t>OpenAI-kompatible Clients nutzen http://ai.b1.germering:11438/v1; native Ollama-Clients nutzen http://ai.b1.germering:11434.</w:t>
+            </w:r>
+          </w:p>
+        </w:tc>
+      </w:tr>
+      <w:tr>
+        <w:tc>
+          <w:tcPr>
+            <w:tcW w:type="dxa" w:w="4876"/>
+            <w:vAlign w:val="center"/>
+            <w:shd w:fill="F3F7F7"/>
+          </w:tcPr>
+          <w:p>
+            <w:r/>
+            <w:r>
+              <w:rPr>
+                <w:rFonts w:ascii="Liberation Sans" w:hAnsi="Liberation Sans"/>
+                <w:b/>
+                <w:color w:val="142C35"/>
+                <w:sz w:val="17"/>
+              </w:rPr>
+              <w:t>Aktive Modellroute</w:t>
+            </w:r>
+          </w:p>
+        </w:tc>
+        <w:tc>
+          <w:tcPr>
+            <w:tcW w:type="dxa" w:w="4876"/>
+            <w:vAlign w:val="center"/>
+          </w:tcPr>
+          <w:p>
+            <w:r/>
+            <w:r>
+              <w:rPr>
+                <w:rFonts w:ascii="Liberation Sans" w:hAnsi="Liberation Sans"/>
+                <w:b w:val="0"/>
+                <w:color w:val="142C35"/>
+                <w:sz w:val="17"/>
+              </w:rPr>
+              <w:t>Alle sieben Editorial- und Research-Aufgaben verwenden gemma4-e4b:64k auf der OpenAI-kompatiblen Primärroute und demselben Modell über die native Ollama-Fallbackroute.</w:t>
+            </w:r>
+          </w:p>
+        </w:tc>
+      </w:tr>
+      <w:tr>
+        <w:tc>
+          <w:tcPr>
+            <w:tcW w:type="dxa" w:w="4876"/>
+            <w:vAlign w:val="center"/>
+            <w:shd w:fill="F3F7F7"/>
+          </w:tcPr>
+          <w:p>
+            <w:r/>
+            <w:r>
+              <w:rPr>
+                <w:rFonts w:ascii="Liberation Sans" w:hAnsi="Liberation Sans"/>
+                <w:b/>
+                <w:color w:val="142C35"/>
+                <w:sz w:val="17"/>
+              </w:rPr>
               <w:t>UI</w:t>
             </w:r>
           </w:p>
@@ -2153,6 +2259,396 @@
                 <w:sz w:val="17"/>
               </w:rPr>
               <w:t>Das Kanalprofil zeigt Stufen, Status, Writer-, Verifier- und Storyboard-Prompt.</w:t>
+            </w:r>
+          </w:p>
+        </w:tc>
+      </w:tr>
+      <w:tr>
+        <w:tc>
+          <w:tcPr>
+            <w:tcW w:type="dxa" w:w="4876"/>
+            <w:vAlign w:val="center"/>
+            <w:shd w:fill="F3F7F7"/>
+          </w:tcPr>
+          <w:p>
+            <w:r/>
+            <w:r>
+              <w:rPr>
+                <w:rFonts w:ascii="Liberation Sans" w:hAnsi="Liberation Sans"/>
+                <w:b/>
+                <w:color w:val="142C35"/>
+                <w:sz w:val="17"/>
+              </w:rPr>
+              <w:t>Suchquellen-Gesundheit</w:t>
+            </w:r>
+          </w:p>
+        </w:tc>
+        <w:tc>
+          <w:tcPr>
+            <w:tcW w:type="dxa" w:w="4876"/>
+            <w:vAlign w:val="center"/>
+          </w:tcPr>
+          <w:p>
+            <w:r/>
+            <w:r>
+              <w:rPr>
+                <w:rFonts w:ascii="Liberation Sans" w:hAnsi="Liberation Sans"/>
+                <w:b w:val="0"/>
+                <w:color w:val="142C35"/>
+                <w:sz w:val="17"/>
+              </w:rPr>
+              <w:t>SearXNG-Ergebnisse, antwortende Engines, Ausfälle, Fallbacks und Relevanzfilter-Zähler bleiben im Workflow-Ergebnis sichtbar.</w:t>
+            </w:r>
+          </w:p>
+        </w:tc>
+      </w:tr>
+      <w:tr>
+        <w:tc>
+          <w:tcPr>
+            <w:tcW w:type="dxa" w:w="4876"/>
+            <w:vAlign w:val="center"/>
+            <w:shd w:fill="F3F7F7"/>
+          </w:tcPr>
+          <w:p>
+            <w:r/>
+            <w:r>
+              <w:rPr>
+                <w:rFonts w:ascii="Liberation Sans" w:hAnsi="Liberation Sans"/>
+                <w:b/>
+                <w:color w:val="142C35"/>
+                <w:sz w:val="17"/>
+              </w:rPr>
+              <w:t>Laststeuerung</w:t>
+            </w:r>
+          </w:p>
+        </w:tc>
+        <w:tc>
+          <w:tcPr>
+            <w:tcW w:type="dxa" w:w="4876"/>
+            <w:vAlign w:val="center"/>
+          </w:tcPr>
+          <w:p>
+            <w:r/>
+            <w:r>
+              <w:rPr>
+                <w:rFonts w:ascii="Liberation Sans" w:hAnsi="Liberation Sans"/>
+                <w:b w:val="0"/>
+                <w:color w:val="142C35"/>
+                <w:sz w:val="17"/>
+              </w:rPr>
+              <w:t>Sieben Strategien laufen sequenziell mit Abstand und begrenztem exponentiellem Retry statt als gleichzeitiger Anfrageburst.</w:t>
+            </w:r>
+          </w:p>
+        </w:tc>
+      </w:tr>
+      <w:tr>
+        <w:tc>
+          <w:tcPr>
+            <w:tcW w:type="dxa" w:w="4876"/>
+            <w:vAlign w:val="center"/>
+            <w:shd w:fill="F3F7F7"/>
+          </w:tcPr>
+          <w:p>
+            <w:r/>
+            <w:r>
+              <w:rPr>
+                <w:rFonts w:ascii="Liberation Sans" w:hAnsi="Liberation Sans"/>
+                <w:b/>
+                <w:color w:val="142C35"/>
+                <w:sz w:val="17"/>
+              </w:rPr>
+              <w:t>Engine-Pools</w:t>
+            </w:r>
+          </w:p>
+        </w:tc>
+        <w:tc>
+          <w:tcPr>
+            <w:tcW w:type="dxa" w:w="4876"/>
+            <w:vAlign w:val="center"/>
+          </w:tcPr>
+          <w:p>
+            <w:r/>
+            <w:r>
+              <w:rPr>
+                <w:rFonts w:ascii="Liberation Sans" w:hAnsi="Liberation Sans"/>
+                <w:b w:val="0"/>
+                <w:color w:val="142C35"/>
+                <w:sz w:val="17"/>
+              </w:rPr>
+              <w:t>Allgemeine Recherche nutzt Bing, Qwant News und Bing News; Primär- und Gegenbelegsuche nutzt Bing, ArXiv und PubMed.</w:t>
+            </w:r>
+          </w:p>
+        </w:tc>
+      </w:tr>
+      <w:tr>
+        <w:tc>
+          <w:tcPr>
+            <w:tcW w:type="dxa" w:w="4876"/>
+            <w:vAlign w:val="center"/>
+            <w:shd w:fill="F3F7F7"/>
+          </w:tcPr>
+          <w:p>
+            <w:r/>
+            <w:r>
+              <w:rPr>
+                <w:rFonts w:ascii="Liberation Sans" w:hAnsi="Liberation Sans"/>
+                <w:b/>
+                <w:color w:val="142C35"/>
+                <w:sz w:val="17"/>
+              </w:rPr>
+              <w:t>Explainer-Relevanz</w:t>
+            </w:r>
+          </w:p>
+        </w:tc>
+        <w:tc>
+          <w:tcPr>
+            <w:tcW w:type="dxa" w:w="4876"/>
+            <w:vAlign w:val="center"/>
+          </w:tcPr>
+          <w:p>
+            <w:r/>
+            <w:r>
+              <w:rPr>
+                <w:rFonts w:ascii="Liberation Sans" w:hAnsi="Liberation Sans"/>
+                <w:b w:val="0"/>
+                <w:color w:val="142C35"/>
+                <w:sz w:val="17"/>
+              </w:rPr>
+              <w:t>Für evidence_first_explainer werden Plattformnavigation und Funde ohne Erklär-, Studien-, Forschungs-, Wirkungs- oder Zusammenhangssignal vor dem Clustering verworfen.</w:t>
+            </w:r>
+          </w:p>
+        </w:tc>
+      </w:tr>
+      <w:tr>
+        <w:tc>
+          <w:tcPr>
+            <w:tcW w:type="dxa" w:w="4876"/>
+            <w:vAlign w:val="center"/>
+            <w:shd w:fill="F3F7F7"/>
+          </w:tcPr>
+          <w:p>
+            <w:r/>
+            <w:r>
+              <w:rPr>
+                <w:rFonts w:ascii="Liberation Sans" w:hAnsi="Liberation Sans"/>
+                <w:b/>
+                <w:color w:val="142C35"/>
+                <w:sz w:val="17"/>
+              </w:rPr>
+              <w:t>Explanation Readiness</w:t>
+            </w:r>
+          </w:p>
+        </w:tc>
+        <w:tc>
+          <w:tcPr>
+            <w:tcW w:type="dxa" w:w="4876"/>
+            <w:vAlign w:val="center"/>
+          </w:tcPr>
+          <w:p>
+            <w:r/>
+            <w:r>
+              <w:rPr>
+                <w:rFonts w:ascii="Liberation Sans" w:hAnsi="Liberation Sans"/>
+                <w:b w:val="0"/>
+                <w:color w:val="142C35"/>
+                <w:sz w:val="17"/>
+              </w:rPr>
+              <w:t>Ein generisches Core-Gate verlangt für dieses Profil 810–1.350 Wörter, mindestens 13 nutzbare Tatsachenclaims, sechs Erkläreinheiten, unabhängige und primäre Quellen sowie eine Gegenbelegsuche.</w:t>
+            </w:r>
+          </w:p>
+        </w:tc>
+      </w:tr>
+      <w:tr>
+        <w:tc>
+          <w:tcPr>
+            <w:tcW w:type="dxa" w:w="4876"/>
+            <w:vAlign w:val="center"/>
+            <w:shd w:fill="F3F7F7"/>
+          </w:tcPr>
+          <w:p>
+            <w:r/>
+            <w:r>
+              <w:rPr>
+                <w:rFonts w:ascii="Liberation Sans" w:hAnsi="Liberation Sans"/>
+                <w:b/>
+                <w:color w:val="142C35"/>
+                <w:sz w:val="17"/>
+              </w:rPr>
+              <w:t>Skalierbare Evidenzübergabe</w:t>
+            </w:r>
+          </w:p>
+        </w:tc>
+        <w:tc>
+          <w:tcPr>
+            <w:tcW w:type="dxa" w:w="4876"/>
+            <w:vAlign w:val="center"/>
+          </w:tcPr>
+          <w:p>
+            <w:r/>
+            <w:r>
+              <w:rPr>
+                <w:rFonts w:ascii="Liberation Sans" w:hAnsi="Liberation Sans"/>
+                <w:b w:val="0"/>
+                <w:color w:val="142C35"/>
+                <w:sz w:val="17"/>
+              </w:rPr>
+              <w:t>Für KI-Synthese und Dossierbildung werden deterministisch die 24 relevantesten unabhängigen Quellen ausgewählt; umfangreiche Semantic Chunks werden nicht über Temporal transportiert.</w:t>
+            </w:r>
+          </w:p>
+        </w:tc>
+      </w:tr>
+      <w:tr>
+        <w:tc>
+          <w:tcPr>
+            <w:tcW w:type="dxa" w:w="4876"/>
+            <w:vAlign w:val="center"/>
+            <w:shd w:fill="F3F7F7"/>
+          </w:tcPr>
+          <w:p>
+            <w:r/>
+            <w:r>
+              <w:rPr>
+                <w:rFonts w:ascii="Liberation Sans" w:hAnsi="Liberation Sans"/>
+                <w:b/>
+                <w:color w:val="142C35"/>
+                <w:sz w:val="17"/>
+              </w:rPr>
+              <w:t>Neuheitspriorisierung</w:t>
+            </w:r>
+          </w:p>
+        </w:tc>
+        <w:tc>
+          <w:tcPr>
+            <w:tcW w:type="dxa" w:w="4876"/>
+            <w:vAlign w:val="center"/>
+          </w:tcPr>
+          <w:p>
+            <w:r/>
+            <w:r>
+              <w:rPr>
+                <w:rFonts w:ascii="Liberation Sans" w:hAnsi="Liberation Sans"/>
+                <w:b w:val="0"/>
+                <w:color w:val="142C35"/>
+                <w:sz w:val="17"/>
+              </w:rPr>
+              <w:t>Folgerunden bieten der KI zuvor ungenutzte wissenschaftliche Werke zuerst an; bereits verwendete Werke bleiben nur als Fallback verfügbar.</w:t>
+            </w:r>
+          </w:p>
+        </w:tc>
+      </w:tr>
+      <w:tr>
+        <w:tc>
+          <w:tcPr>
+            <w:tcW w:type="dxa" w:w="4876"/>
+            <w:vAlign w:val="center"/>
+            <w:shd w:fill="F3F7F7"/>
+          </w:tcPr>
+          <w:p>
+            <w:r/>
+            <w:r>
+              <w:rPr>
+                <w:rFonts w:ascii="Liberation Sans" w:hAnsi="Liberation Sans"/>
+                <w:b/>
+                <w:color w:val="142C35"/>
+                <w:sz w:val="17"/>
+              </w:rPr>
+              <w:t>Autonome Kandidatenfolge</w:t>
+            </w:r>
+          </w:p>
+        </w:tc>
+        <w:tc>
+          <w:tcPr>
+            <w:tcW w:type="dxa" w:w="4876"/>
+            <w:vAlign w:val="center"/>
+          </w:tcPr>
+          <w:p>
+            <w:r/>
+            <w:r>
+              <w:rPr>
+                <w:rFonts w:ascii="Liberation Sans" w:hAnsi="Liberation Sans"/>
+                <w:b w:val="0"/>
+                <w:color w:val="142C35"/>
+                <w:sz w:val="17"/>
+              </w:rPr>
+              <w:t>Bleibt ein freigegebenes Thema nach drei Runden unzureichend, akquiriert und untersucht der Workflow selbstständig den nächsten freigegebenen Kandidaten. Harte Review-Gates werden dabei nicht gelockert.</w:t>
+            </w:r>
+          </w:p>
+        </w:tc>
+      </w:tr>
+      <w:tr>
+        <w:tc>
+          <w:tcPr>
+            <w:tcW w:type="dxa" w:w="4876"/>
+            <w:vAlign w:val="center"/>
+            <w:shd w:fill="F3F7F7"/>
+          </w:tcPr>
+          <w:p>
+            <w:r/>
+            <w:r>
+              <w:rPr>
+                <w:rFonts w:ascii="Liberation Sans" w:hAnsi="Liberation Sans"/>
+                <w:b/>
+                <w:color w:val="142C35"/>
+                <w:sz w:val="17"/>
+              </w:rPr>
+              <w:t>Skript-Gates</w:t>
+            </w:r>
+          </w:p>
+        </w:tc>
+        <w:tc>
+          <w:tcPr>
+            <w:tcW w:type="dxa" w:w="4876"/>
+            <w:vAlign w:val="center"/>
+          </w:tcPr>
+          <w:p>
+            <w:r/>
+            <w:r>
+              <w:rPr>
+                <w:rFonts w:ascii="Liberation Sans" w:hAnsi="Liberation Sans"/>
+                <w:b w:val="0"/>
+                <w:color w:val="142C35"/>
+                <w:sz w:val="17"/>
+              </w:rPr>
+              <w:t>810–1.350 Wörter, 360–600 Sekunden und mindestens 13 unterschiedliche Tatsachenclaims werden nach der KI-Ausgabe deterministisch erzwungen.</w:t>
+            </w:r>
+          </w:p>
+        </w:tc>
+      </w:tr>
+      <w:tr>
+        <w:tc>
+          <w:tcPr>
+            <w:tcW w:type="dxa" w:w="4876"/>
+            <w:vAlign w:val="center"/>
+            <w:shd w:fill="F3F7F7"/>
+          </w:tcPr>
+          <w:p>
+            <w:r/>
+            <w:r>
+              <w:rPr>
+                <w:rFonts w:ascii="Liberation Sans" w:hAnsi="Liberation Sans"/>
+                <w:b/>
+                <w:color w:val="142C35"/>
+                <w:sz w:val="17"/>
+              </w:rPr>
+              <w:t>Storyboard-Gates</w:t>
+            </w:r>
+          </w:p>
+        </w:tc>
+        <w:tc>
+          <w:tcPr>
+            <w:tcW w:type="dxa" w:w="4876"/>
+            <w:vAlign w:val="center"/>
+          </w:tcPr>
+          <w:p>
+            <w:r/>
+            <w:r>
+              <w:rPr>
+                <w:rFonts w:ascii="Liberation Sans" w:hAnsi="Liberation Sans"/>
+                <w:b w:val="0"/>
+                <w:color w:val="142C35"/>
+                <w:sz w:val="17"/>
+              </w:rPr>
+              <w:t>Konkrete On-Screen-Cues, narration-gebundene Visuals, wechselnde Visualtypen und höchstens 15 % Übergangsszenen werden deterministisch geprüft.</w:t>
             </w:r>
           </w:p>
         </w:tc>
@@ -2238,6 +2734,11 @@
     </w:tbl>
     <w:p/>
     <w:p>
+      <w:r>
+        <w:br w:type="page"/>
+      </w:r>
+    </w:p>
+    <w:p>
       <w:pPr>
         <w:pStyle w:val="Heading2"/>
       </w:pPr>
@@ -2315,7 +2816,7 @@
                 <w:color w:val="142C35"/>
                 <w:sz w:val="17"/>
               </w:rPr>
-              <w:t>Core + API</w:t>
+              <w:t>Core</w:t>
             </w:r>
           </w:p>
         </w:tc>
@@ -2333,7 +2834,85 @@
                 <w:color w:val="142C35"/>
                 <w:sz w:val="17"/>
               </w:rPr>
-              <w:t>101 Tests bestanden</w:t>
+              <w:t>58 Tests bestanden; einschließlich generischer Explanation-Readiness-Policy</w:t>
+            </w:r>
+          </w:p>
+        </w:tc>
+      </w:tr>
+      <w:tr>
+        <w:tc>
+          <w:tcPr>
+            <w:tcW w:type="dxa" w:w="4876"/>
+            <w:vAlign w:val="center"/>
+            <w:shd w:fill="F3F7F7"/>
+          </w:tcPr>
+          <w:p>
+            <w:r/>
+            <w:r>
+              <w:rPr>
+                <w:rFonts w:ascii="Liberation Sans" w:hAnsi="Liberation Sans"/>
+                <w:b/>
+                <w:color w:val="142C35"/>
+                <w:sz w:val="17"/>
+              </w:rPr>
+              <w:t>API</w:t>
+            </w:r>
+          </w:p>
+        </w:tc>
+        <w:tc>
+          <w:tcPr>
+            <w:tcW w:type="dxa" w:w="4876"/>
+            <w:vAlign w:val="center"/>
+          </w:tcPr>
+          <w:p>
+            <w:r/>
+            <w:r>
+              <w:rPr>
+                <w:rFonts w:ascii="Liberation Sans" w:hAnsi="Liberation Sans"/>
+                <w:b w:val="0"/>
+                <w:color w:val="142C35"/>
+                <w:sz w:val="17"/>
+              </w:rPr>
+              <w:t>112 Tests bestanden; einschließlich Versionierung, Readiness-Feldern und Skript-Sperre</w:t>
+            </w:r>
+          </w:p>
+        </w:tc>
+      </w:tr>
+      <w:tr>
+        <w:tc>
+          <w:tcPr>
+            <w:tcW w:type="dxa" w:w="4876"/>
+            <w:vAlign w:val="center"/>
+            <w:shd w:fill="F3F7F7"/>
+          </w:tcPr>
+          <w:p>
+            <w:r/>
+            <w:r>
+              <w:rPr>
+                <w:rFonts w:ascii="Liberation Sans" w:hAnsi="Liberation Sans"/>
+                <w:b/>
+                <w:color w:val="142C35"/>
+                <w:sz w:val="17"/>
+              </w:rPr>
+              <w:t>Research Worker</w:t>
+            </w:r>
+          </w:p>
+        </w:tc>
+        <w:tc>
+          <w:tcPr>
+            <w:tcW w:type="dxa" w:w="4876"/>
+            <w:vAlign w:val="center"/>
+          </w:tcPr>
+          <w:p>
+            <w:r/>
+            <w:r>
+              <w:rPr>
+                <w:rFonts w:ascii="Liberation Sans" w:hAnsi="Liberation Sans"/>
+                <w:b w:val="0"/>
+                <w:color w:val="142C35"/>
+                <w:sz w:val="17"/>
+              </w:rPr>
+              <w:t>66 Tests bestanden; einschließlich kumulativem Claim-Bestand, stabilen Erkläreinheiten, Quellen-Alias-Deduplizierung und Kandidatenübergabe</w:t>
             </w:r>
           </w:p>
         </w:tc>
@@ -2372,7 +2951,7 @@
                 <w:color w:val="142C35"/>
                 <w:sz w:val="17"/>
               </w:rPr>
-              <w:t>16 Tests bestanden</w:t>
+              <w:t>49 Tests bestanden; einschließlich stabiler Enrichment-Pläne, KI-Evidenzfeedback, Wiederholungssperre, priorisierter neuer Werke, begrenzter KI-Payloads, Activity-Heartbeat sowie Skript- und Storyboard-Hard-Gates</w:t>
             </w:r>
           </w:p>
         </w:tc>
@@ -2549,6 +3128,84 @@
                 <w:color w:val="142C35"/>
                 <w:sz w:val="17"/>
               </w:rPr>
+              <w:t>Live Discovery</w:t>
+            </w:r>
+          </w:p>
+        </w:tc>
+        <w:tc>
+          <w:tcPr>
+            <w:tcW w:type="dxa" w:w="4876"/>
+            <w:vAlign w:val="center"/>
+          </w:tcPr>
+          <w:p>
+            <w:r/>
+            <w:r>
+              <w:rPr>
+                <w:rFonts w:ascii="Liberation Sans" w:hAnsi="Liberation Sans"/>
+                <w:b w:val="0"/>
+                <w:color w:val="142C35"/>
+                <w:sz w:val="17"/>
+              </w:rPr>
+              <w:t>70 Rohresultate; 18 geeignet; 52 irrelevant; 16 dedupliziert; 11 neue Opportunities; 3 antwortende Engines</w:t>
+            </w:r>
+          </w:p>
+        </w:tc>
+      </w:tr>
+      <w:tr>
+        <w:tc>
+          <w:tcPr>
+            <w:tcW w:type="dxa" w:w="4876"/>
+            <w:vAlign w:val="center"/>
+            <w:shd w:fill="F3F7F7"/>
+          </w:tcPr>
+          <w:p>
+            <w:r/>
+            <w:r>
+              <w:rPr>
+                <w:rFonts w:ascii="Liberation Sans" w:hAnsi="Liberation Sans"/>
+                <w:b/>
+                <w:color w:val="142C35"/>
+                <w:sz w:val="17"/>
+              </w:rPr>
+              <w:t>Live Dossier</w:t>
+            </w:r>
+          </w:p>
+        </w:tc>
+        <w:tc>
+          <w:tcPr>
+            <w:tcW w:type="dxa" w:w="4876"/>
+            <w:vAlign w:val="center"/>
+          </w:tcPr>
+          <w:p>
+            <w:r/>
+            <w:r>
+              <w:rPr>
+                <w:rFonts w:ascii="Liberation Sans" w:hAnsi="Liberation Sans"/>
+                <w:b w:val="0"/>
+                <w:color w:val="142C35"/>
+                <w:sz w:val="17"/>
+              </w:rPr>
+              <w:t>Lithium v11 explanation-ready: 14/13 nutzbare Claims, 7/6 Erkläreinheiten, 9 unabhängige und 6 Primärquellen, Gegenbelegsuche abgeschlossen</w:t>
+            </w:r>
+          </w:p>
+        </w:tc>
+      </w:tr>
+      <w:tr>
+        <w:tc>
+          <w:tcPr>
+            <w:tcW w:type="dxa" w:w="4876"/>
+            <w:vAlign w:val="center"/>
+            <w:shd w:fill="F3F7F7"/>
+          </w:tcPr>
+          <w:p>
+            <w:r/>
+            <w:r>
+              <w:rPr>
+                <w:rFonts w:ascii="Liberation Sans" w:hAnsi="Liberation Sans"/>
+                <w:b/>
+                <w:color w:val="142C35"/>
+                <w:sz w:val="17"/>
+              </w:rPr>
               <w:t>Runtime</w:t>
             </w:r>
           </w:p>
@@ -2567,7 +3224,7 @@
                 <w:color w:val="142C35"/>
                 <w:sz w:val="17"/>
               </w:rPr>
-              <w:t>API, Web und Editorial Worker healthy nach Deploy</w:t>
+              <w:t>API, Web, Research Worker und Editorial Worker healthy nach Deploy</w:t>
             </w:r>
           </w:p>
         </w:tc>
@@ -2584,7 +3241,1178 @@
         <w:pStyle w:val="Heading1"/>
       </w:pPr>
       <w:r>
-        <w:t>7. Grenzen und verantwortlicher Einsatz</w:t>
+        <w:t>7. Explanation Readiness und autonome Optimierung</w:t>
+      </w:r>
+    </w:p>
+    <w:p>
+      <w:r>
+        <w:t>Ein Dossier ist nicht mehr allein deshalb produktionsreif, weil wenige Claims formal belegt sind. Das neue Gate berechnet aus Zieldauer und Sprechtempo zunächst den benötigten Textumfang und daraus die minimale Zahl unterschiedlicher Fakten. Für FaktischSimpel ergibt das einen Korridor von 360–600 Sekunden beziehungsweise 810–1.350 Wörtern und mindestens 13 Tatsachenclaims.</w:t>
+      </w:r>
+    </w:p>
+    <w:tbl>
+      <w:tblPr>
+        <w:tblStyle w:val="TableGrid"/>
+        <w:tblW w:type="auto" w:w="0"/>
+        <w:jc w:val="center"/>
+        <w:tblLook w:firstColumn="1" w:firstRow="1" w:lastColumn="0" w:lastRow="0" w:noHBand="0" w:noVBand="1" w:val="04A0"/>
+      </w:tblPr>
+      <w:tblGrid>
+        <w:gridCol w:w="4876"/>
+        <w:gridCol w:w="4876"/>
+      </w:tblGrid>
+      <w:tr>
+        <w:trPr>
+          <w:tblHeader w:val="true"/>
+        </w:trPr>
+        <w:tc>
+          <w:tcPr>
+            <w:tcW w:type="dxa" w:w="4876"/>
+            <w:shd w:fill="0D6F70"/>
+            <w:vAlign w:val="center"/>
+          </w:tcPr>
+          <w:p>
+            <w:r/>
+            <w:r>
+              <w:rPr>
+                <w:rFonts w:ascii="Liberation Sans" w:hAnsi="Liberation Sans"/>
+                <w:b/>
+                <w:color w:val="FFFFFF"/>
+                <w:sz w:val="17"/>
+              </w:rPr>
+              <w:t>Gate</w:t>
+            </w:r>
+          </w:p>
+        </w:tc>
+        <w:tc>
+          <w:tcPr>
+            <w:tcW w:type="dxa" w:w="4876"/>
+            <w:shd w:fill="0D6F70"/>
+            <w:vAlign w:val="center"/>
+          </w:tcPr>
+          <w:p>
+            <w:r/>
+            <w:r>
+              <w:rPr>
+                <w:rFonts w:ascii="Liberation Sans" w:hAnsi="Liberation Sans"/>
+                <w:b/>
+                <w:color w:val="FFFFFF"/>
+                <w:sz w:val="17"/>
+              </w:rPr>
+              <w:t>Erzwungenes Verhalten</w:t>
+            </w:r>
+          </w:p>
+        </w:tc>
+      </w:tr>
+      <w:tr>
+        <w:tc>
+          <w:tcPr>
+            <w:tcW w:type="dxa" w:w="4876"/>
+            <w:vAlign w:val="center"/>
+            <w:shd w:fill="F3F7F7"/>
+          </w:tcPr>
+          <w:p>
+            <w:r/>
+            <w:r>
+              <w:rPr>
+                <w:rFonts w:ascii="Liberation Sans" w:hAnsi="Liberation Sans"/>
+                <w:b/>
+                <w:color w:val="142C35"/>
+                <w:sz w:val="17"/>
+              </w:rPr>
+              <w:t>Erklärplan</w:t>
+            </w:r>
+          </w:p>
+        </w:tc>
+        <w:tc>
+          <w:tcPr>
+            <w:tcW w:type="dxa" w:w="4876"/>
+            <w:vAlign w:val="center"/>
+          </w:tcPr>
+          <w:p>
+            <w:r/>
+            <w:r>
+              <w:rPr>
+                <w:rFonts w:ascii="Liberation Sans" w:hAnsi="Liberation Sans"/>
+                <w:b w:val="0"/>
+                <w:color w:val="142C35"/>
+                <w:sz w:val="17"/>
+              </w:rPr>
+              <w:t>Mindestens 6 wesentliche Einheiten: Grundlage, Mechanismus, Evidenz, Grenzen, Folgen und offene Fragen</w:t>
+            </w:r>
+          </w:p>
+        </w:tc>
+      </w:tr>
+      <w:tr>
+        <w:tc>
+          <w:tcPr>
+            <w:tcW w:type="dxa" w:w="4876"/>
+            <w:vAlign w:val="center"/>
+            <w:shd w:fill="F3F7F7"/>
+          </w:tcPr>
+          <w:p>
+            <w:r/>
+            <w:r>
+              <w:rPr>
+                <w:rFonts w:ascii="Liberation Sans" w:hAnsi="Liberation Sans"/>
+                <w:b/>
+                <w:color w:val="142C35"/>
+                <w:sz w:val="17"/>
+              </w:rPr>
+              <w:t>Evidenz</w:t>
+            </w:r>
+          </w:p>
+        </w:tc>
+        <w:tc>
+          <w:tcPr>
+            <w:tcW w:type="dxa" w:w="4876"/>
+            <w:vAlign w:val="center"/>
+          </w:tcPr>
+          <w:p>
+            <w:r/>
+            <w:r>
+              <w:rPr>
+                <w:rFonts w:ascii="Liberation Sans" w:hAnsi="Liberation Sans"/>
+                <w:b w:val="0"/>
+                <w:color w:val="142C35"/>
+                <w:sz w:val="17"/>
+              </w:rPr>
+              <w:t>Mindestens 13 nutzbare atomare Claims bei 1,5 Claims je 100 Wörter</w:t>
+            </w:r>
+          </w:p>
+        </w:tc>
+      </w:tr>
+      <w:tr>
+        <w:tc>
+          <w:tcPr>
+            <w:tcW w:type="dxa" w:w="4876"/>
+            <w:vAlign w:val="center"/>
+            <w:shd w:fill="F3F7F7"/>
+          </w:tcPr>
+          <w:p>
+            <w:r/>
+            <w:r>
+              <w:rPr>
+                <w:rFonts w:ascii="Liberation Sans" w:hAnsi="Liberation Sans"/>
+                <w:b/>
+                <w:color w:val="142C35"/>
+                <w:sz w:val="17"/>
+              </w:rPr>
+              <w:t>Quellen</w:t>
+            </w:r>
+          </w:p>
+        </w:tc>
+        <w:tc>
+          <w:tcPr>
+            <w:tcW w:type="dxa" w:w="4876"/>
+            <w:vAlign w:val="center"/>
+          </w:tcPr>
+          <w:p>
+            <w:r/>
+            <w:r>
+              <w:rPr>
+                <w:rFonts w:ascii="Liberation Sans" w:hAnsi="Liberation Sans"/>
+                <w:b w:val="0"/>
+                <w:color w:val="142C35"/>
+                <w:sz w:val="17"/>
+              </w:rPr>
+              <w:t>Mindestens 2 unabhängige Quellen, davon 1 Primärquelle; Gegenbelegsuche muss ausgeführt sein</w:t>
+            </w:r>
+          </w:p>
+        </w:tc>
+      </w:tr>
+      <w:tr>
+        <w:tc>
+          <w:tcPr>
+            <w:tcW w:type="dxa" w:w="4876"/>
+            <w:vAlign w:val="center"/>
+            <w:shd w:fill="F3F7F7"/>
+          </w:tcPr>
+          <w:p>
+            <w:r/>
+            <w:r>
+              <w:rPr>
+                <w:rFonts w:ascii="Liberation Sans" w:hAnsi="Liberation Sans"/>
+                <w:b/>
+                <w:color w:val="142C35"/>
+                <w:sz w:val="17"/>
+              </w:rPr>
+              <w:t>Optimierung</w:t>
+            </w:r>
+          </w:p>
+        </w:tc>
+        <w:tc>
+          <w:tcPr>
+            <w:tcW w:type="dxa" w:w="4876"/>
+            <w:vAlign w:val="center"/>
+          </w:tcPr>
+          <w:p>
+            <w:r/>
+            <w:r>
+              <w:rPr>
+                <w:rFonts w:ascii="Liberation Sans" w:hAnsi="Liberation Sans"/>
+                <w:b w:val="0"/>
+                <w:color w:val="142C35"/>
+                <w:sz w:val="17"/>
+              </w:rPr>
+              <w:t>Bis zu 3 KI-geplante, lückenspezifische Such- und Syntheserunden über die LAN-KI</w:t>
+            </w:r>
+          </w:p>
+        </w:tc>
+      </w:tr>
+      <w:tr>
+        <w:tc>
+          <w:tcPr>
+            <w:tcW w:type="dxa" w:w="4876"/>
+            <w:vAlign w:val="center"/>
+            <w:shd w:fill="F3F7F7"/>
+          </w:tcPr>
+          <w:p>
+            <w:r/>
+            <w:r>
+              <w:rPr>
+                <w:rFonts w:ascii="Liberation Sans" w:hAnsi="Liberation Sans"/>
+                <w:b/>
+                <w:color w:val="142C35"/>
+                <w:sz w:val="17"/>
+              </w:rPr>
+              <w:t>Claim-Bestand</w:t>
+            </w:r>
+          </w:p>
+        </w:tc>
+        <w:tc>
+          <w:tcPr>
+            <w:tcW w:type="dxa" w:w="4876"/>
+            <w:vAlign w:val="center"/>
+          </w:tcPr>
+          <w:p>
+            <w:r/>
+            <w:r>
+              <w:rPr>
+                <w:rFonts w:ascii="Liberation Sans" w:hAnsi="Liberation Sans"/>
+                <w:b w:val="0"/>
+                <w:color w:val="142C35"/>
+                <w:sz w:val="17"/>
+              </w:rPr>
+              <w:t>Neue atomare Claims werden über alle Runden kumuliert; nahe Paraphrasen werden zusammengeführt und ihre exakten Evidence-IDs vereinigt</w:t>
+            </w:r>
+          </w:p>
+        </w:tc>
+      </w:tr>
+      <w:tr>
+        <w:tc>
+          <w:tcPr>
+            <w:tcW w:type="dxa" w:w="4876"/>
+            <w:vAlign w:val="center"/>
+            <w:shd w:fill="F3F7F7"/>
+          </w:tcPr>
+          <w:p>
+            <w:r/>
+            <w:r>
+              <w:rPr>
+                <w:rFonts w:ascii="Liberation Sans" w:hAnsi="Liberation Sans"/>
+                <w:b/>
+                <w:color w:val="142C35"/>
+                <w:sz w:val="17"/>
+              </w:rPr>
+              <w:t>Thesenrollen</w:t>
+            </w:r>
+          </w:p>
+        </w:tc>
+        <w:tc>
+          <w:tcPr>
+            <w:tcW w:type="dxa" w:w="4876"/>
+            <w:vAlign w:val="center"/>
+          </w:tcPr>
+          <w:p>
+            <w:r/>
+            <w:r>
+              <w:rPr>
+                <w:rFonts w:ascii="Liberation Sans" w:hAnsi="Liberation Sans"/>
+                <w:b w:val="0"/>
+                <w:color w:val="142C35"/>
+                <w:sz w:val="17"/>
+              </w:rPr>
+              <w:t>Maximal vier deterministisch geeignete Aussagen bleiben zentral; belastbare Definitionen, Mechanismen, Beispiele und Grenzen bleiben als unterstützende Claims erhalten</w:t>
+            </w:r>
+          </w:p>
+        </w:tc>
+      </w:tr>
+      <w:tr>
+        <w:tc>
+          <w:tcPr>
+            <w:tcW w:type="dxa" w:w="4876"/>
+            <w:vAlign w:val="center"/>
+            <w:shd w:fill="F3F7F7"/>
+          </w:tcPr>
+          <w:p>
+            <w:r/>
+            <w:r>
+              <w:rPr>
+                <w:rFonts w:ascii="Liberation Sans" w:hAnsi="Liberation Sans"/>
+                <w:b/>
+                <w:color w:val="142C35"/>
+                <w:sz w:val="17"/>
+              </w:rPr>
+              <w:t>Rückkopplung</w:t>
+            </w:r>
+          </w:p>
+        </w:tc>
+        <w:tc>
+          <w:tcPr>
+            <w:tcW w:type="dxa" w:w="4876"/>
+            <w:vAlign w:val="center"/>
+          </w:tcPr>
+          <w:p>
+            <w:r/>
+            <w:r>
+              <w:rPr>
+                <w:rFonts w:ascii="Liberation Sans" w:hAnsi="Liberation Sans"/>
+                <w:b w:val="0"/>
+                <w:color w:val="142C35"/>
+                <w:sz w:val="17"/>
+              </w:rPr>
+              <w:t>Die LAN-KI prüft den Zwischenstand quellengebunden; ihre Lückenhinweise steuern die nächste Suche, können aber kein deterministisches Gate überstimmen</w:t>
+            </w:r>
+          </w:p>
+        </w:tc>
+      </w:tr>
+      <w:tr>
+        <w:tc>
+          <w:tcPr>
+            <w:tcW w:type="dxa" w:w="4876"/>
+            <w:vAlign w:val="center"/>
+            <w:shd w:fill="F3F7F7"/>
+          </w:tcPr>
+          <w:p>
+            <w:r/>
+            <w:r>
+              <w:rPr>
+                <w:rFonts w:ascii="Liberation Sans" w:hAnsi="Liberation Sans"/>
+                <w:b/>
+                <w:color w:val="142C35"/>
+                <w:sz w:val="17"/>
+              </w:rPr>
+              <w:t>Abbruchschutz</w:t>
+            </w:r>
+          </w:p>
+        </w:tc>
+        <w:tc>
+          <w:tcPr>
+            <w:tcW w:type="dxa" w:w="4876"/>
+            <w:vAlign w:val="center"/>
+          </w:tcPr>
+          <w:p>
+            <w:r/>
+            <w:r>
+              <w:rPr>
+                <w:rFonts w:ascii="Liberation Sans" w:hAnsi="Liberation Sans"/>
+                <w:b w:val="0"/>
+                <w:color w:val="142C35"/>
+                <w:sz w:val="17"/>
+              </w:rPr>
+              <w:t>Meta-Claims über Dokumente, Quellenverfügbarkeit oder den Rechercheprozess zählen nicht als Fachbeleg</w:t>
+            </w:r>
+          </w:p>
+        </w:tc>
+      </w:tr>
+      <w:tr>
+        <w:tc>
+          <w:tcPr>
+            <w:tcW w:type="dxa" w:w="4876"/>
+            <w:vAlign w:val="center"/>
+            <w:shd w:fill="F3F7F7"/>
+          </w:tcPr>
+          <w:p>
+            <w:r/>
+            <w:r>
+              <w:rPr>
+                <w:rFonts w:ascii="Liberation Sans" w:hAnsi="Liberation Sans"/>
+                <w:b/>
+                <w:color w:val="142C35"/>
+                <w:sz w:val="17"/>
+              </w:rPr>
+              <w:t>Kandidatenwechsel</w:t>
+            </w:r>
+          </w:p>
+        </w:tc>
+        <w:tc>
+          <w:tcPr>
+            <w:tcW w:type="dxa" w:w="4876"/>
+            <w:vAlign w:val="center"/>
+          </w:tcPr>
+          <w:p>
+            <w:r/>
+            <w:r>
+              <w:rPr>
+                <w:rFonts w:ascii="Liberation Sans" w:hAnsi="Liberation Sans"/>
+                <w:b w:val="0"/>
+                <w:color w:val="142C35"/>
+                <w:sz w:val="17"/>
+              </w:rPr>
+              <w:t>Bei fortbestehenden Lücken automatische Übergabe an den nächsten bereits menschlich freigegebenen Kandidaten, maximal zwei Wechsel pro Reihe</w:t>
+            </w:r>
+          </w:p>
+        </w:tc>
+      </w:tr>
+    </w:tbl>
+    <w:p/>
+    <w:p>
+      <w:pPr>
+        <w:keepNext/>
+        <w:jc w:val="center"/>
+      </w:pPr>
+      <w:r>
+        <w:drawing>
+          <wp:inline xmlns:a="http://schemas.openxmlformats.org/drawingml/2006/main" xmlns:pic="http://schemas.openxmlformats.org/drawingml/2006/picture">
+            <wp:extent cx="5669280" cy="131191930"/>
+            <wp:docPr id="7" name="Picture 7"/>
+            <wp:cNvGraphicFramePr>
+              <a:graphicFrameLocks noChangeAspect="1"/>
+            </wp:cNvGraphicFramePr>
+            <a:graphic>
+              <a:graphicData uri="http://schemas.openxmlformats.org/drawingml/2006/picture">
+                <pic:pic>
+                  <pic:nvPicPr>
+                    <pic:cNvPr id="0" name="10-explanation-readiness-legacy-gate.png"/>
+                    <pic:cNvPicPr/>
+                  </pic:nvPicPr>
+                  <pic:blipFill>
+                    <a:blip r:embed="rId17"/>
+                    <a:stretch>
+                      <a:fillRect/>
+                    </a:stretch>
+                  </pic:blipFill>
+                  <pic:spPr>
+                    <a:xfrm>
+                      <a:off x="0" y="0"/>
+                      <a:ext cx="5669280" cy="131191930"/>
+                    </a:xfrm>
+                    <a:prstGeom prst="rect"/>
+                  </pic:spPr>
+                </pic:pic>
+              </a:graphicData>
+            </a:graphic>
+          </wp:inline>
+        </w:drawing>
+      </w:r>
+    </w:p>
+    <w:p>
+      <w:pPr>
+        <w:spacing w:before="60" w:after="160"/>
+        <w:jc w:val="center"/>
+      </w:pPr>
+      <w:r>
+        <w:rPr>
+          <w:i/>
+          <w:color w:val="5E6E74"/>
+          <w:sz w:val="16"/>
+        </w:rPr>
+        <w:t>Abbildung 7 – Auch früher genehmigte Dossiers erscheinen als Needs evidence, wenn ihnen die neue vollständige Readiness-Auswertung fehlt.</w:t>
+      </w:r>
+    </w:p>
+    <w:p>
+      <w:pPr>
+        <w:keepNext/>
+        <w:jc w:val="center"/>
+      </w:pPr>
+      <w:r>
+        <w:drawing>
+          <wp:inline xmlns:a="http://schemas.openxmlformats.org/drawingml/2006/main" xmlns:pic="http://schemas.openxmlformats.org/drawingml/2006/picture">
+            <wp:extent cx="5669280" cy="5662466"/>
+            <wp:docPr id="8" name="Picture 8"/>
+            <wp:cNvGraphicFramePr>
+              <a:graphicFrameLocks noChangeAspect="1"/>
+            </wp:cNvGraphicFramePr>
+            <a:graphic>
+              <a:graphicData uri="http://schemas.openxmlformats.org/drawingml/2006/picture">
+                <pic:pic>
+                  <pic:nvPicPr>
+                    <pic:cNvPr id="0" name="11-explanation-readiness-policy-fields.png"/>
+                    <pic:cNvPicPr/>
+                  </pic:nvPicPr>
+                  <pic:blipFill>
+                    <a:blip r:embed="rId18"/>
+                    <a:stretch>
+                      <a:fillRect/>
+                    </a:stretch>
+                  </pic:blipFill>
+                  <pic:spPr>
+                    <a:xfrm>
+                      <a:off x="0" y="0"/>
+                      <a:ext cx="5669280" cy="5662466"/>
+                    </a:xfrm>
+                    <a:prstGeom prst="rect"/>
+                  </pic:spPr>
+                </pic:pic>
+              </a:graphicData>
+            </a:graphic>
+          </wp:inline>
+        </w:drawing>
+      </w:r>
+    </w:p>
+    <w:p>
+      <w:pPr>
+        <w:spacing w:before="60" w:after="160"/>
+        <w:jc w:val="center"/>
+      </w:pPr>
+      <w:r>
+        <w:rPr>
+          <w:i/>
+          <w:color w:val="5E6E74"/>
+          <w:sz w:val="16"/>
+        </w:rPr>
+        <w:t>Abbildung 8 – Dauer, Sprechtempo, maximale Evidenzrunden und Mindestzahl der Erkläreinheiten sind im Subject-Profil transparent konfigurierbar.</w:t>
+      </w:r>
+    </w:p>
+    <w:p>
+      <w:pPr>
+        <w:keepNext/>
+        <w:jc w:val="center"/>
+      </w:pPr>
+      <w:r>
+        <w:drawing>
+          <wp:inline xmlns:a="http://schemas.openxmlformats.org/drawingml/2006/main" xmlns:pic="http://schemas.openxmlformats.org/drawingml/2006/picture">
+            <wp:extent cx="5669280" cy="3188970"/>
+            <wp:docPr id="9" name="Picture 9"/>
+            <wp:cNvGraphicFramePr>
+              <a:graphicFrameLocks noChangeAspect="1"/>
+            </wp:cNvGraphicFramePr>
+            <a:graphic>
+              <a:graphicData uri="http://schemas.openxmlformats.org/drawingml/2006/picture">
+                <pic:pic>
+                  <pic:nvPicPr>
+                    <pic:cNvPr id="0" name="12-explanation-readiness-result.png"/>
+                    <pic:cNvPicPr/>
+                  </pic:nvPicPr>
+                  <pic:blipFill>
+                    <a:blip r:embed="rId19"/>
+                    <a:stretch>
+                      <a:fillRect/>
+                    </a:stretch>
+                  </pic:blipFill>
+                  <pic:spPr>
+                    <a:xfrm>
+                      <a:off x="0" y="0"/>
+                      <a:ext cx="5669280" cy="3188970"/>
+                    </a:xfrm>
+                    <a:prstGeom prst="rect"/>
+                  </pic:spPr>
+                </pic:pic>
+              </a:graphicData>
+            </a:graphic>
+          </wp:inline>
+        </w:drawing>
+      </w:r>
+    </w:p>
+    <w:p>
+      <w:pPr>
+        <w:spacing w:before="60" w:after="160"/>
+        <w:jc w:val="center"/>
+      </w:pPr>
+      <w:r>
+        <w:rPr>
+          <w:i/>
+          <w:color w:val="5E6E74"/>
+          <w:sz w:val="16"/>
+        </w:rPr>
+        <w:t>Abbildung 9 – Der reale Lithium-Test wurde nach drei LAN-KI-Runden korrekt blockiert: 4 von 13 Claims und fehlende wesentliche Erkläreinheiten reichen nicht für ein belastbares Video.</w:t>
+      </w:r>
+    </w:p>
+    <w:p>
+      <w:pPr>
+        <w:keepNext/>
+        <w:jc w:val="center"/>
+      </w:pPr>
+      <w:r>
+        <w:drawing>
+          <wp:inline xmlns:a="http://schemas.openxmlformats.org/drawingml/2006/main" xmlns:pic="http://schemas.openxmlformats.org/drawingml/2006/picture">
+            <wp:extent cx="5669280" cy="3188970"/>
+            <wp:docPr id="10" name="Picture 10"/>
+            <wp:cNvGraphicFramePr>
+              <a:graphicFrameLocks noChangeAspect="1"/>
+            </wp:cNvGraphicFramePr>
+            <a:graphic>
+              <a:graphicData uri="http://schemas.openxmlformats.org/drawingml/2006/picture">
+                <pic:pic>
+                  <pic:nvPicPr>
+                    <pic:cNvPr id="0" name="13-autonomous-candidate-result.png"/>
+                    <pic:cNvPicPr/>
+                  </pic:nvPicPr>
+                  <pic:blipFill>
+                    <a:blip r:embed="rId20"/>
+                    <a:stretch>
+                      <a:fillRect/>
+                    </a:stretch>
+                  </pic:blipFill>
+                  <pic:spPr>
+                    <a:xfrm>
+                      <a:off x="0" y="0"/>
+                      <a:ext cx="5669280" cy="3188970"/>
+                    </a:xfrm>
+                    <a:prstGeom prst="rect"/>
+                  </pic:spPr>
+                </pic:pic>
+              </a:graphicData>
+            </a:graphic>
+          </wp:inline>
+        </w:drawing>
+      </w:r>
+    </w:p>
+    <w:p>
+      <w:pPr>
+        <w:spacing w:before="60" w:after="160"/>
+        <w:jc w:val="center"/>
+      </w:pPr>
+      <w:r>
+        <w:rPr>
+          <w:i/>
+          <w:color w:val="5E6E74"/>
+          <w:sz w:val="16"/>
+        </w:rPr>
+        <w:t>Abbildung 10 – Nach dem autonomen Kandidatenwechsel akquirierte TubeFactory 22 Snapshots und deckte alle sechs Erkläreinheiten ab; mit 6 von 13 Claims blieb aber auch dieses Thema sicher vor der Skriptstufe blockiert.</w:t>
+      </w:r>
+    </w:p>
+    <w:tbl>
+      <w:tblPr>
+        <w:tblW w:type="auto" w:w="0"/>
+        <w:jc w:val="center"/>
+        <w:tblLook w:firstColumn="1" w:firstRow="1" w:lastColumn="0" w:lastRow="0" w:noHBand="0" w:noVBand="1" w:val="04A0"/>
+      </w:tblPr>
+      <w:tblGrid>
+        <w:gridCol w:w="9752"/>
+      </w:tblGrid>
+      <w:tr>
+        <w:tc>
+          <w:tcPr>
+            <w:tcW w:type="dxa" w:w="9752"/>
+            <w:shd w:fill="EAF4F4"/>
+          </w:tcPr>
+          <w:p>
+            <w:pPr>
+              <w:spacing w:after="40"/>
+            </w:pPr>
+            <w:r>
+              <w:rPr>
+                <w:b/>
+                <w:color w:val="0D6F70"/>
+              </w:rPr>
+              <w:t xml:space="preserve">Korrigierter generischer Ansatz  </w:t>
+            </w:r>
+            <w:r>
+              <w:t>Der Erklärplan wird zu Beginn einer Reihe einmal festgelegt und bleibt danach stabil. Jede Syntheserunde erhält den bisherigen Claim-Bestand, bearbeitet nur fehlende oder dünn belegte Einheiten und liefert zusätzliche atomare Aussagen. Bereits verwendete Evidence-IDs werden der Folgerunde nicht erneut angeboten. Quellen-Aliase werden über wissenschaftliche Werk-IDs zusammengeführt; zwei Auszüge desselben Werks zählen deshalb weiterhin nur als eine unabhängige Quelle. Schwächer belegte Details werden nicht mehr verworfen, sondern als nicht-zentrale Claims behalten, sofern mindestens ein exakter Direktbeleg vorhanden ist.</w:t>
+            </w:r>
+          </w:p>
+        </w:tc>
+      </w:tr>
+    </w:tbl>
+    <w:p>
+      <w:pPr>
+        <w:spacing w:after="0"/>
+      </w:pPr>
+    </w:p>
+    <w:tbl>
+      <w:tblPr>
+        <w:tblW w:type="auto" w:w="0"/>
+        <w:jc w:val="center"/>
+        <w:tblLook w:firstColumn="1" w:firstRow="1" w:lastColumn="0" w:lastRow="0" w:noHBand="0" w:noVBand="1" w:val="04A0"/>
+      </w:tblPr>
+      <w:tblGrid>
+        <w:gridCol w:w="9752"/>
+      </w:tblGrid>
+      <w:tr>
+        <w:tc>
+          <w:tcPr>
+            <w:tcW w:type="dxa" w:w="9752"/>
+            <w:shd w:fill="EAF4F4"/>
+          </w:tcPr>
+          <w:p>
+            <w:pPr>
+              <w:spacing w:after="40"/>
+            </w:pPr>
+            <w:r>
+              <w:rPr>
+                <w:b/>
+                <w:color w:val="0D6F70"/>
+              </w:rPr>
+              <w:t xml:space="preserve">Warum das bessere Ergebnis zunächst ein Block ist  </w:t>
+            </w:r>
+            <w:r>
+              <w:t>Das frühere kurze Skript sah formal vollständig aus, hatte aber nur drei fachliche Claims. Das neue System verweigert diese Scheinsicherheit, benennt die konkreten Lücken und setzt die Recherche beziehungsweise Kandidatenauswahl automatisch fort.</w:t>
+            </w:r>
+          </w:p>
+        </w:tc>
+      </w:tr>
+    </w:tbl>
+    <w:p>
+      <w:pPr>
+        <w:spacing w:after="0"/>
+      </w:pPr>
+    </w:p>
+    <w:p>
+      <w:r>
+        <w:br w:type="page"/>
+      </w:r>
+    </w:p>
+    <w:tbl>
+      <w:tblPr>
+        <w:tblW w:type="auto" w:w="0"/>
+        <w:jc w:val="center"/>
+        <w:tblLook w:firstColumn="1" w:firstRow="1" w:lastColumn="0" w:lastRow="0" w:noHBand="0" w:noVBand="1" w:val="04A0"/>
+      </w:tblPr>
+      <w:tblGrid>
+        <w:gridCol w:w="9752"/>
+      </w:tblGrid>
+      <w:tr>
+        <w:tc>
+          <w:tcPr>
+            <w:tcW w:type="dxa" w:w="9752"/>
+            <w:shd w:fill="EAF4F4"/>
+          </w:tcPr>
+          <w:p>
+            <w:pPr>
+              <w:spacing w:after="40"/>
+            </w:pPr>
+            <w:r>
+              <w:rPr>
+                <w:b/>
+                <w:color w:val="0D6F70"/>
+              </w:rPr>
+              <w:t xml:space="preserve">Finaler autonomer Live-Nachweis  </w:t>
+            </w:r>
+            <w:r>
+              <w:t>Workflow live-research-dossier-corrected-claim-bank-feedback-v2-lithium-20260722a lief ohne manuelle Datenmanipulation bis DOSSIER_REVIEW. Dossier f67ac324-8ce5-4edc-bec8-dbd68aefd30f erreichte 14/13 nutzbare Claims, deckte alle sieben Erklärungseinheiten ab und belegte sie mit 9 unabhängigen sowie 6 Primärquellen. Die Gegenbelegsuche war abgeschlossen; das abschließende quellengebundene LAN-KI-Review bewertete 14 Claims und 9 Quellen ohne Abstention bei Konfidenz 1,0.</w:t>
+            </w:r>
+          </w:p>
+        </w:tc>
+      </w:tr>
+    </w:tbl>
+    <w:p>
+      <w:pPr>
+        <w:spacing w:after="0"/>
+      </w:pPr>
+    </w:p>
+    <w:p>
+      <w:pPr>
+        <w:keepNext/>
+        <w:jc w:val="center"/>
+      </w:pPr>
+      <w:r>
+        <w:drawing>
+          <wp:inline xmlns:a="http://schemas.openxmlformats.org/drawingml/2006/main" xmlns:pic="http://schemas.openxmlformats.org/drawingml/2006/picture">
+            <wp:extent cx="5669280" cy="3679709"/>
+            <wp:docPr id="11" name="Picture 11"/>
+            <wp:cNvGraphicFramePr>
+              <a:graphicFrameLocks noChangeAspect="1"/>
+            </wp:cNvGraphicFramePr>
+            <a:graphic>
+              <a:graphicData uri="http://schemas.openxmlformats.org/drawingml/2006/picture">
+                <pic:pic>
+                  <pic:nvPicPr>
+                    <pic:cNvPr id="0" name="14-corrected-claim-bank-result.png"/>
+                    <pic:cNvPicPr/>
+                  </pic:nvPicPr>
+                  <pic:blipFill>
+                    <a:blip r:embed="rId21"/>
+                    <a:stretch>
+                      <a:fillRect/>
+                    </a:stretch>
+                  </pic:blipFill>
+                  <pic:spPr>
+                    <a:xfrm>
+                      <a:off x="0" y="0"/>
+                      <a:ext cx="5669280" cy="3679709"/>
+                    </a:xfrm>
+                    <a:prstGeom prst="rect"/>
+                  </pic:spPr>
+                </pic:pic>
+              </a:graphicData>
+            </a:graphic>
+          </wp:inline>
+        </w:drawing>
+      </w:r>
+    </w:p>
+    <w:p>
+      <w:pPr>
+        <w:spacing w:before="60" w:after="160"/>
+        <w:jc w:val="center"/>
+      </w:pPr>
+      <w:r>
+        <w:rPr>
+          <w:i/>
+          <w:color w:val="5E6E74"/>
+          <w:sz w:val="16"/>
+        </w:rPr>
+        <w:t>Abbildung 11 – Der vollständig korrigierte Lithium-Lauf ist explanation-ready: 14/13 Claims, sieben abgedeckte Erkläreinheiten, neun unabhängige und sechs Primärquellen sowie abgeschlossene Gegenbelegsuche.</w:t>
+      </w:r>
+    </w:p>
+    <w:p>
+      <w:r>
+        <w:br w:type="page"/>
+      </w:r>
+    </w:p>
+    <w:p>
+      <w:pPr>
+        <w:pStyle w:val="Heading1"/>
+      </w:pPr>
+      <w:r>
+        <w:t>8. Erhaltener Baseline-Lauf vor dem Readiness-Gate</w:t>
+      </w:r>
+    </w:p>
+    <w:p>
+      <w:r>
+        <w:t>Für die neue Reihe wurden die älteren FaktischSimpel-Findings recoverable archiviert. Das System entdeckte anschließend selbstständig ein neues Thema zur Lithiumgewinnung aus geothermischen Systemen. Die menschlichen Prüfschritte wurden für diesen Test bewusst übernommen; Skript- und Storyboardtexte wurden nicht manuell manipuliert.</w:t>
+      </w:r>
+    </w:p>
+    <w:tbl>
+      <w:tblPr>
+        <w:tblStyle w:val="TableGrid"/>
+        <w:tblW w:type="auto" w:w="0"/>
+        <w:jc w:val="center"/>
+        <w:tblLook w:firstColumn="1" w:firstRow="1" w:lastColumn="0" w:lastRow="0" w:noHBand="0" w:noVBand="1" w:val="04A0"/>
+      </w:tblPr>
+      <w:tblGrid>
+        <w:gridCol w:w="4876"/>
+        <w:gridCol w:w="4876"/>
+      </w:tblGrid>
+      <w:tr>
+        <w:trPr>
+          <w:tblHeader w:val="true"/>
+        </w:trPr>
+        <w:tc>
+          <w:tcPr>
+            <w:tcW w:type="dxa" w:w="4876"/>
+            <w:shd w:fill="0D6F70"/>
+            <w:vAlign w:val="center"/>
+          </w:tcPr>
+          <w:p>
+            <w:r/>
+            <w:r>
+              <w:rPr>
+                <w:rFonts w:ascii="Liberation Sans" w:hAnsi="Liberation Sans"/>
+                <w:b/>
+                <w:color w:val="FFFFFF"/>
+                <w:sz w:val="17"/>
+              </w:rPr>
+              <w:t>Artefakt</w:t>
+            </w:r>
+          </w:p>
+        </w:tc>
+        <w:tc>
+          <w:tcPr>
+            <w:tcW w:type="dxa" w:w="4876"/>
+            <w:shd w:fill="0D6F70"/>
+            <w:vAlign w:val="center"/>
+          </w:tcPr>
+          <w:p>
+            <w:r/>
+            <w:r>
+              <w:rPr>
+                <w:rFonts w:ascii="Liberation Sans" w:hAnsi="Liberation Sans"/>
+                <w:b/>
+                <w:color w:val="FFFFFF"/>
+                <w:sz w:val="17"/>
+              </w:rPr>
+              <w:t>Live-Ergebnis</w:t>
+            </w:r>
+          </w:p>
+        </w:tc>
+      </w:tr>
+      <w:tr>
+        <w:tc>
+          <w:tcPr>
+            <w:tcW w:type="dxa" w:w="4876"/>
+            <w:vAlign w:val="center"/>
+            <w:shd w:fill="F3F7F7"/>
+          </w:tcPr>
+          <w:p>
+            <w:r/>
+            <w:r>
+              <w:rPr>
+                <w:rFonts w:ascii="Liberation Sans" w:hAnsi="Liberation Sans"/>
+                <w:b/>
+                <w:color w:val="142C35"/>
+                <w:sz w:val="17"/>
+              </w:rPr>
+              <w:t>Ausgewähltes Thema</w:t>
+            </w:r>
+          </w:p>
+        </w:tc>
+        <w:tc>
+          <w:tcPr>
+            <w:tcW w:type="dxa" w:w="4876"/>
+            <w:vAlign w:val="center"/>
+          </w:tcPr>
+          <w:p>
+            <w:r/>
+            <w:r>
+              <w:rPr>
+                <w:rFonts w:ascii="Liberation Sans" w:hAnsi="Liberation Sans"/>
+                <w:b w:val="0"/>
+                <w:color w:val="142C35"/>
+                <w:sz w:val="17"/>
+              </w:rPr>
+              <w:t>Herausforderungen und Chancen für die Lithiumgewinnung aus geothermischen Systemen in Deutschland</w:t>
+            </w:r>
+          </w:p>
+        </w:tc>
+      </w:tr>
+      <w:tr>
+        <w:tc>
+          <w:tcPr>
+            <w:tcW w:type="dxa" w:w="4876"/>
+            <w:vAlign w:val="center"/>
+            <w:shd w:fill="F3F7F7"/>
+          </w:tcPr>
+          <w:p>
+            <w:r/>
+            <w:r>
+              <w:rPr>
+                <w:rFonts w:ascii="Liberation Sans" w:hAnsi="Liberation Sans"/>
+                <w:b/>
+                <w:color w:val="142C35"/>
+                <w:sz w:val="17"/>
+              </w:rPr>
+              <w:t>Evidenzdossier</w:t>
+            </w:r>
+          </w:p>
+        </w:tc>
+        <w:tc>
+          <w:tcPr>
+            <w:tcW w:type="dxa" w:w="4876"/>
+            <w:vAlign w:val="center"/>
+          </w:tcPr>
+          <w:p>
+            <w:r/>
+            <w:r>
+              <w:rPr>
+                <w:rFonts w:ascii="Liberation Sans" w:hAnsi="Liberation Sans"/>
+                <w:b w:val="0"/>
+                <w:color w:val="142C35"/>
+                <w:sz w:val="17"/>
+              </w:rPr>
+              <w:t>Historische Version 2; 3 atomare Claims; nach neuer Policy nicht mehr explanation-ready</w:t>
+            </w:r>
+          </w:p>
+        </w:tc>
+      </w:tr>
+      <w:tr>
+        <w:tc>
+          <w:tcPr>
+            <w:tcW w:type="dxa" w:w="4876"/>
+            <w:vAlign w:val="center"/>
+            <w:shd w:fill="F3F7F7"/>
+          </w:tcPr>
+          <w:p>
+            <w:r/>
+            <w:r>
+              <w:rPr>
+                <w:rFonts w:ascii="Liberation Sans" w:hAnsi="Liberation Sans"/>
+                <w:b/>
+                <w:color w:val="142C35"/>
+                <w:sz w:val="17"/>
+              </w:rPr>
+              <w:t>Skript</w:t>
+            </w:r>
+          </w:p>
+        </w:tc>
+        <w:tc>
+          <w:tcPr>
+            <w:tcW w:type="dxa" w:w="4876"/>
+            <w:vAlign w:val="center"/>
+          </w:tcPr>
+          <w:p>
+            <w:r/>
+            <w:r>
+              <w:rPr>
+                <w:rFonts w:ascii="Liberation Sans" w:hAnsi="Liberation Sans"/>
+                <w:b w:val="0"/>
+                <w:color w:val="142C35"/>
+                <w:sz w:val="17"/>
+              </w:rPr>
+              <w:t>Version 31 freigegeben; 8 Segmente; 410 Wörter; 182,2 Sekunden; 100 % Central-Claim-Coverage; 0 Fehler und 0 Warnungen</w:t>
+            </w:r>
+          </w:p>
+        </w:tc>
+      </w:tr>
+      <w:tr>
+        <w:tc>
+          <w:tcPr>
+            <w:tcW w:type="dxa" w:w="4876"/>
+            <w:vAlign w:val="center"/>
+            <w:shd w:fill="F3F7F7"/>
+          </w:tcPr>
+          <w:p>
+            <w:r/>
+            <w:r>
+              <w:rPr>
+                <w:rFonts w:ascii="Liberation Sans" w:hAnsi="Liberation Sans"/>
+                <w:b/>
+                <w:color w:val="142C35"/>
+                <w:sz w:val="17"/>
+              </w:rPr>
+              <w:t>Skript-Hash</w:t>
+            </w:r>
+          </w:p>
+        </w:tc>
+        <w:tc>
+          <w:tcPr>
+            <w:tcW w:type="dxa" w:w="4876"/>
+            <w:vAlign w:val="center"/>
+          </w:tcPr>
+          <w:p>
+            <w:r/>
+            <w:r>
+              <w:rPr>
+                <w:rFonts w:ascii="Liberation Sans" w:hAnsi="Liberation Sans"/>
+                <w:b w:val="0"/>
+                <w:color w:val="142C35"/>
+                <w:sz w:val="17"/>
+              </w:rPr>
+              <w:t>7f5e454c6330968b0cf6882306c88785dd56b9ce752d955e49dd1d17ee66846b</w:t>
+            </w:r>
+          </w:p>
+        </w:tc>
+      </w:tr>
+      <w:tr>
+        <w:tc>
+          <w:tcPr>
+            <w:tcW w:type="dxa" w:w="4876"/>
+            <w:vAlign w:val="center"/>
+            <w:shd w:fill="F3F7F7"/>
+          </w:tcPr>
+          <w:p>
+            <w:r/>
+            <w:r>
+              <w:rPr>
+                <w:rFonts w:ascii="Liberation Sans" w:hAnsi="Liberation Sans"/>
+                <w:b/>
+                <w:color w:val="142C35"/>
+                <w:sz w:val="17"/>
+              </w:rPr>
+              <w:t>Storyboard</w:t>
+            </w:r>
+          </w:p>
+        </w:tc>
+        <w:tc>
+          <w:tcPr>
+            <w:tcW w:type="dxa" w:w="4876"/>
+            <w:vAlign w:val="center"/>
+          </w:tcPr>
+          <w:p>
+            <w:r/>
+            <w:r>
+              <w:rPr>
+                <w:rFonts w:ascii="Liberation Sans" w:hAnsi="Liberation Sans"/>
+                <w:b w:val="0"/>
+                <w:color w:val="142C35"/>
+                <w:sz w:val="17"/>
+              </w:rPr>
+              <w:t>Version 8 freigegeben; 8 Szenen; 182,2 Sekunden; 7 visuelle Rollen mit Claim- und Quellenbindung</w:t>
+            </w:r>
+          </w:p>
+        </w:tc>
+      </w:tr>
+      <w:tr>
+        <w:tc>
+          <w:tcPr>
+            <w:tcW w:type="dxa" w:w="4876"/>
+            <w:vAlign w:val="center"/>
+            <w:shd w:fill="F3F7F7"/>
+          </w:tcPr>
+          <w:p>
+            <w:r/>
+            <w:r>
+              <w:rPr>
+                <w:rFonts w:ascii="Liberation Sans" w:hAnsi="Liberation Sans"/>
+                <w:b/>
+                <w:color w:val="142C35"/>
+                <w:sz w:val="17"/>
+              </w:rPr>
+              <w:t>Storyboard-Hash</w:t>
+            </w:r>
+          </w:p>
+        </w:tc>
+        <w:tc>
+          <w:tcPr>
+            <w:tcW w:type="dxa" w:w="4876"/>
+            <w:vAlign w:val="center"/>
+          </w:tcPr>
+          <w:p>
+            <w:r/>
+            <w:r>
+              <w:rPr>
+                <w:rFonts w:ascii="Liberation Sans" w:hAnsi="Liberation Sans"/>
+                <w:b w:val="0"/>
+                <w:color w:val="142C35"/>
+                <w:sz w:val="17"/>
+              </w:rPr>
+              <w:t>1a54a75c75303e2d058ec2a29ec65800d4551f9d1549ee158c59bab3ba14bb84</w:t>
+            </w:r>
+          </w:p>
+        </w:tc>
+      </w:tr>
+    </w:tbl>
+    <w:p/>
+    <w:p>
+      <w:pPr>
+        <w:keepNext/>
+        <w:jc w:val="center"/>
+      </w:pPr>
+      <w:r>
+        <w:drawing>
+          <wp:inline xmlns:a="http://schemas.openxmlformats.org/drawingml/2006/main" xmlns:pic="http://schemas.openxmlformats.org/drawingml/2006/picture">
+            <wp:extent cx="5669280" cy="1615149"/>
+            <wp:docPr id="12" name="Picture 12"/>
+            <wp:cNvGraphicFramePr>
+              <a:graphicFrameLocks noChangeAspect="1"/>
+            </wp:cNvGraphicFramePr>
+            <a:graphic>
+              <a:graphicData uri="http://schemas.openxmlformats.org/drawingml/2006/picture">
+                <pic:pic>
+                  <pic:nvPicPr>
+                    <pic:cNvPr id="0" name="08-approved-script-storyboard-hashes.png"/>
+                    <pic:cNvPicPr/>
+                  </pic:nvPicPr>
+                  <pic:blipFill>
+                    <a:blip r:embed="rId22"/>
+                    <a:stretch>
+                      <a:fillRect/>
+                    </a:stretch>
+                  </pic:blipFill>
+                  <pic:spPr>
+                    <a:xfrm>
+                      <a:off x="0" y="0"/>
+                      <a:ext cx="5669280" cy="1615149"/>
+                    </a:xfrm>
+                    <a:prstGeom prst="rect"/>
+                  </pic:spPr>
+                </pic:pic>
+              </a:graphicData>
+            </a:graphic>
+          </wp:inline>
+        </w:drawing>
+      </w:r>
+    </w:p>
+    <w:p>
+      <w:pPr>
+        <w:spacing w:before="60" w:after="160"/>
+        <w:jc w:val="center"/>
+      </w:pPr>
+      <w:r>
+        <w:rPr>
+          <w:i/>
+          <w:color w:val="5E6E74"/>
+          <w:sz w:val="16"/>
+        </w:rPr>
+        <w:t>Abbildung 12 – Die erhaltenen unveränderlichen Baseline-Versionen mit Abdeckung, Szenenzahl und Hash-Präfixen.</w:t>
+      </w:r>
+    </w:p>
+    <w:p>
+      <w:pPr>
+        <w:pStyle w:val="Heading2"/>
+      </w:pPr>
+      <w:r>
+        <w:t>Automatisch behobene Qualitätsprobleme</w:t>
       </w:r>
     </w:p>
     <w:p>
@@ -2592,7 +4420,7 @@
         <w:pStyle w:val="ListBullet"/>
       </w:pPr>
       <w:r>
-        <w:t>Das Themenradar liefert Kandidaten, keine redaktionelle Wahrheit. Ein leerer Lauf ist besser als erfundene Themen.</w:t>
+        <w:t>HTTP-Antworten lokaler Modelle werden jetzt bis zum tatsächlichen Stream-Ende gelesen; ein einzelner Teil-Read kann valides JSON nicht mehr abschneiden.</w:t>
       </w:r>
     </w:p>
     <w:p>
@@ -2600,7 +4428,219 @@
         <w:pStyle w:val="ListBullet"/>
       </w:pPr>
       <w:r>
-        <w:t>Die Qualität des Skripts hängt von den zuvor freigegebenen Claims und Quellen ab; der Prompt kann ein schwaches Dossier nicht reparieren.</w:t>
+        <w:t>Writer-Ausgaben werden segmentweise erzeugt, von zwei AI-Prüfungen bewertet und in höchstens zwei begrenzten Korrekturpässen automatisch überarbeitet.</w:t>
+      </w:r>
+    </w:p>
+    <w:p>
+      <w:pPr>
+        <w:pStyle w:val="ListBullet"/>
+      </w:pPr>
+      <w:r>
+        <w:t>Deterministische Gates blockieren weiterhin unbelegte Aussagen, unzulässige Quellenlücken und wiederholte Faktenblöcke, auch wenn ein Modell widersprüchliche Bewertungsfelder liefert.</w:t>
+      </w:r>
+    </w:p>
+    <w:p>
+      <w:pPr>
+        <w:pStyle w:val="ListBullet"/>
+      </w:pPr>
+      <w:r>
+        <w:t>Wo kein geprüfter Gegenclaim existiert, erzeugt das System eine klar nicht-faktische Gegenbeleg- und Unsicherheitsstruktur statt eine Behauptung zu erfinden.</w:t>
+      </w:r>
+    </w:p>
+    <w:p>
+      <w:pPr>
+        <w:pStyle w:val="ListBullet"/>
+      </w:pPr>
+      <w:r>
+        <w:t>Storyboards erhalten eine automatische visuelle Diversitätsplanung sowie source-bound Visual-Briefs; semantisch valide Alternativen werden lokal in den unveränderlichen SceneSpec-Vertrag eingebettet.</w:t>
+      </w:r>
+    </w:p>
+    <w:p>
+      <w:pPr>
+        <w:pStyle w:val="ListBullet"/>
+      </w:pPr>
+      <w:r>
+        <w:t>Ein veralteter zweiter Editorial Worker wurde gestoppt, damit nur der aktuelle TubeFactory-Worker die Temporal-Queue verarbeitet.</w:t>
+      </w:r>
+    </w:p>
+    <w:p>
+      <w:pPr>
+        <w:keepNext/>
+        <w:jc w:val="center"/>
+      </w:pPr>
+      <w:r>
+        <w:drawing>
+          <wp:inline xmlns:a="http://schemas.openxmlformats.org/drawingml/2006/main" xmlns:pic="http://schemas.openxmlformats.org/drawingml/2006/picture">
+            <wp:extent cx="3337560" cy="8522584"/>
+            <wp:docPr id="13" name="Picture 13"/>
+            <wp:cNvGraphicFramePr>
+              <a:graphicFrameLocks noChangeAspect="1"/>
+            </wp:cNvGraphicFramePr>
+            <a:graphic>
+              <a:graphicData uri="http://schemas.openxmlformats.org/drawingml/2006/picture">
+                <pic:pic>
+                  <pic:nvPicPr>
+                    <pic:cNvPr id="0" name="09-approved-script-v31.png"/>
+                    <pic:cNvPicPr/>
+                  </pic:nvPicPr>
+                  <pic:blipFill>
+                    <a:blip r:embed="rId23"/>
+                    <a:stretch>
+                      <a:fillRect/>
+                    </a:stretch>
+                  </pic:blipFill>
+                  <pic:spPr>
+                    <a:xfrm>
+                      <a:off x="0" y="0"/>
+                      <a:ext cx="3337560" cy="8522584"/>
+                    </a:xfrm>
+                    <a:prstGeom prst="rect"/>
+                  </pic:spPr>
+                </pic:pic>
+              </a:graphicData>
+            </a:graphic>
+          </wp:inline>
+        </w:drawing>
+      </w:r>
+    </w:p>
+    <w:p>
+      <w:pPr>
+        <w:spacing w:before="60" w:after="160"/>
+        <w:jc w:val="center"/>
+      </w:pPr>
+      <w:r>
+        <w:rPr>
+          <w:i/>
+          <w:color w:val="5E6E74"/>
+          <w:sz w:val="16"/>
+        </w:rPr>
+        <w:t>Abbildung 13 – Das erhaltene Baseline-Skript v31 mit unabhängiger Prüfung, exaktem Hash und segmentweiser Evidenzzuordnung.</w:t>
+      </w:r>
+    </w:p>
+    <w:p>
+      <w:r>
+        <w:br w:type="page"/>
+      </w:r>
+    </w:p>
+    <w:p>
+      <w:pPr>
+        <w:keepNext/>
+        <w:jc w:val="center"/>
+      </w:pPr>
+      <w:r>
+        <w:drawing>
+          <wp:inline xmlns:a="http://schemas.openxmlformats.org/drawingml/2006/main" xmlns:pic="http://schemas.openxmlformats.org/drawingml/2006/picture">
+            <wp:extent cx="5486400" cy="7893912"/>
+            <wp:docPr id="14" name="Picture 14"/>
+            <wp:cNvGraphicFramePr>
+              <a:graphicFrameLocks noChangeAspect="1"/>
+            </wp:cNvGraphicFramePr>
+            <a:graphic>
+              <a:graphicData uri="http://schemas.openxmlformats.org/drawingml/2006/picture">
+                <pic:pic>
+                  <pic:nvPicPr>
+                    <pic:cNvPr id="0" name="07-approved-storyboard-v8.png"/>
+                    <pic:cNvPicPr/>
+                  </pic:nvPicPr>
+                  <pic:blipFill>
+                    <a:blip r:embed="rId24"/>
+                    <a:stretch>
+                      <a:fillRect/>
+                    </a:stretch>
+                  </pic:blipFill>
+                  <pic:spPr>
+                    <a:xfrm>
+                      <a:off x="0" y="0"/>
+                      <a:ext cx="5486400" cy="7893912"/>
+                    </a:xfrm>
+                    <a:prstGeom prst="rect"/>
+                  </pic:spPr>
+                </pic:pic>
+              </a:graphicData>
+            </a:graphic>
+          </wp:inline>
+        </w:drawing>
+      </w:r>
+    </w:p>
+    <w:p>
+      <w:pPr>
+        <w:spacing w:before="60" w:after="160"/>
+        <w:jc w:val="center"/>
+      </w:pPr>
+      <w:r>
+        <w:rPr>
+          <w:i/>
+          <w:color w:val="5E6E74"/>
+          <w:sz w:val="16"/>
+        </w:rPr>
+        <w:t>Abbildung 14 – Das erhaltene Baseline-Storyboard v8: acht zeitlich abgestimmte Szenen mit unterschiedlichen Visualtypen und expliziten Claim-Bindungen.</w:t>
+      </w:r>
+    </w:p>
+    <w:tbl>
+      <w:tblPr>
+        <w:tblW w:type="auto" w:w="0"/>
+        <w:jc w:val="center"/>
+        <w:tblLook w:firstColumn="1" w:firstRow="1" w:lastColumn="0" w:lastRow="0" w:noHBand="0" w:noVBand="1" w:val="04A0"/>
+      </w:tblPr>
+      <w:tblGrid>
+        <w:gridCol w:w="9752"/>
+      </w:tblGrid>
+      <w:tr>
+        <w:tc>
+          <w:tcPr>
+            <w:tcW w:type="dxa" w:w="9752"/>
+            <w:shd w:fill="EAF4F4"/>
+          </w:tcPr>
+          <w:p>
+            <w:pPr>
+              <w:spacing w:after="40"/>
+            </w:pPr>
+            <w:r>
+              <w:rPr>
+                <w:b/>
+                <w:color w:val="0D6F70"/>
+              </w:rPr>
+              <w:t xml:space="preserve">Einordnung der Baseline  </w:t>
+            </w:r>
+            <w:r>
+              <w:t>Die unveränderlichen Artefakte bleiben als Audit-Baseline erhalten. Mit 410 Wörtern, 182 Sekunden und nur drei fachlichen Claims würden sie die neue 6–10-Minuten- und Explanation-Readiness-Policy nicht mehr passieren.</w:t>
+            </w:r>
+          </w:p>
+        </w:tc>
+      </w:tr>
+    </w:tbl>
+    <w:p>
+      <w:pPr>
+        <w:spacing w:after="0"/>
+      </w:pPr>
+    </w:p>
+    <w:p>
+      <w:r>
+        <w:br w:type="page"/>
+      </w:r>
+    </w:p>
+    <w:p>
+      <w:pPr>
+        <w:pStyle w:val="Heading1"/>
+      </w:pPr>
+      <w:r>
+        <w:t>9. Grenzen und verantwortlicher Einsatz</w:t>
+      </w:r>
+    </w:p>
+    <w:p>
+      <w:pPr>
+        <w:pStyle w:val="ListBullet"/>
+      </w:pPr>
+      <w:r>
+        <w:t>Das Themenradar liefert Kandidaten, keine redaktionelle Wahrheit. Ein quellenbedingt leerer Lauf wird als Fehler sichtbar; ein nachweislich gesunder Leer-Lauf darf weiterhin keine künstlichen Themen erzeugen.</w:t>
+      </w:r>
+    </w:p>
+    <w:p>
+      <w:pPr>
+        <w:pStyle w:val="ListBullet"/>
+      </w:pPr>
+      <w:r>
+        <w:t>Ein schwaches Dossier wird nicht durch Prompt-Rhetorik kaschiert: Es löst gezielte Evidenzrunden, einen autonomen Kandidatenwechsel oder einen sichtbaren Wartezustand aus.</w:t>
       </w:r>
     </w:p>
     <w:p>
@@ -2673,6 +4713,14 @@
       </w:pPr>
       <w:r>
         <w:t>Bei der Dossierprüfung Primärquelle, Unabhängigkeit, Gegenbelege und offene Fragen explizit kontrollieren.</w:t>
+      </w:r>
+    </w:p>
+    <w:p>
+      <w:pPr>
+        <w:pStyle w:val="ListBullet"/>
+      </w:pPr>
+      <w:r>
+        <w:t>Explanation Readiness muss ready anzeigen; Needs evidence sperrt Skriptgenerierung unabhängig von früheren Freigaben.</w:t>
       </w:r>
     </w:p>
     <w:p>

</xml_diff>